<commit_message>
docs: update technical report with final architecture
</commit_message>
<xml_diff>
--- a/docs/Informe_Tecnico_Grupo8_Air_Quality.docx
+++ b/docs/Informe_Tecnico_Grupo8_Air_Quality.docx
@@ -656,13 +656,8 @@
         <w:t xml:space="preserve">Finalmente se utilizaron 12 variables predictoras y se creó la variable objetivo </w:t>
       </w:r>
       <w:proofErr w:type="spellStart"/>
-      <w:proofErr w:type="gramStart"/>
-      <w:r>
-        <w:t>target</w:t>
-      </w:r>
-      <w:proofErr w:type="gramEnd"/>
-      <w:r>
-        <w:t>_next_hour</w:t>
+      <w:r>
+        <w:t>target_next_hour</w:t>
       </w:r>
       <w:proofErr w:type="spellEnd"/>
       <w:r>
@@ -1518,23 +1513,12 @@
         <w:jc w:val="center"/>
       </w:pPr>
       <w:r>
-        <w:rPr>
-          <w:noProof/>
-        </w:rPr>
         <w:lastRenderedPageBreak/>
         <w:drawing>
-          <wp:anchor distT="0" distB="0" distL="114300" distR="114300" simplePos="0" relativeHeight="251658240" behindDoc="0" locked="0" layoutInCell="1" allowOverlap="1" wp14:anchorId="01516333" wp14:editId="5AD74B70">
-            <wp:simplePos x="1081377" y="898497"/>
-            <wp:positionH relativeFrom="margin">
-              <wp:align>center</wp:align>
-            </wp:positionH>
-            <wp:positionV relativeFrom="margin">
-              <wp:align>top</wp:align>
-            </wp:positionV>
-            <wp:extent cx="6101466" cy="6676500"/>
-            <wp:effectExtent l="0" t="0" r="0" b="0"/>
-            <wp:wrapSquare wrapText="bothSides"/>
-            <wp:docPr id="652923812" name="Imagen 2"/>
+          <wp:inline distT="0" distB="0" distL="0" distR="0" wp14:anchorId="42DD5347" wp14:editId="682BF17A">
+            <wp:extent cx="5985841" cy="6550019"/>
+            <wp:effectExtent l="0" t="0" r="0" b="3810"/>
+            <wp:docPr id="1112637499" name="Imagen 2"/>
             <wp:cNvGraphicFramePr>
               <a:graphicFrameLocks xmlns:a="http://schemas.openxmlformats.org/drawingml/2006/main" noChangeAspect="1"/>
             </wp:cNvGraphicFramePr>
@@ -1542,7 +1526,7 @@
               <a:graphicData uri="http://schemas.openxmlformats.org/drawingml/2006/picture">
                 <pic:pic xmlns:pic="http://schemas.openxmlformats.org/drawingml/2006/picture">
                   <pic:nvPicPr>
-                    <pic:cNvPr id="0" name="Picture 2"/>
+                    <pic:cNvPr id="0" name="Picture 6"/>
                     <pic:cNvPicPr>
                       <a:picLocks noChangeAspect="1" noChangeArrowheads="1"/>
                     </pic:cNvPicPr>
@@ -1563,19 +1547,27 @@
                   <pic:spPr bwMode="auto">
                     <a:xfrm>
                       <a:off x="0" y="0"/>
-                      <a:ext cx="6101466" cy="6676500"/>
+                      <a:ext cx="5992661" cy="6557482"/>
                     </a:xfrm>
                     <a:prstGeom prst="rect">
                       <a:avLst/>
                     </a:prstGeom>
                     <a:noFill/>
+                    <a:ln>
+                      <a:noFill/>
+                    </a:ln>
                   </pic:spPr>
                 </pic:pic>
               </a:graphicData>
             </a:graphic>
-          </wp:anchor>
+          </wp:inline>
         </w:drawing>
       </w:r>
+    </w:p>
+    <w:p>
+      <w:pPr>
+        <w:jc w:val="center"/>
+      </w:pPr>
     </w:p>
     <w:p>
       <w:pPr>
@@ -2305,7 +2297,6 @@
   <w:style w:type="character" w:default="1" w:styleId="Fuentedeprrafopredeter">
     <w:name w:val="Default Paragraph Font"/>
     <w:uiPriority w:val="1"/>
-    <w:semiHidden/>
     <w:unhideWhenUsed/>
   </w:style>
   <w:style w:type="table" w:default="1" w:styleId="Tablanormal">

</xml_diff>